<commit_message>
Arreglos en el cronograma
</commit_message>
<xml_diff>
--- a/Evidencias/2. Evidencias_PPP_Ayo.docx
+++ b/Evidencias/2. Evidencias_PPP_Ayo.docx
@@ -758,29 +758,7 @@
           <w:szCs w:val="18"/>
           <w:lang w:val="es-EC"/>
         </w:rPr>
-        <w:t xml:space="preserve">Práctica </w:t>
-      </w:r>
-      <w:proofErr w:type="gramStart"/>
-      <w:r>
-        <w:rPr>
-          <w:rFonts w:ascii="Times New Roman" w:hAnsi="Times New Roman"/>
-          <w:b/>
-          <w:sz w:val="18"/>
-          <w:szCs w:val="18"/>
-          <w:lang w:val="es-EC"/>
-        </w:rPr>
-        <w:t>pre profesional</w:t>
-      </w:r>
-      <w:proofErr w:type="gramEnd"/>
-      <w:r>
-        <w:rPr>
-          <w:rFonts w:ascii="Times New Roman" w:hAnsi="Times New Roman"/>
-          <w:b/>
-          <w:sz w:val="18"/>
-          <w:szCs w:val="18"/>
-          <w:lang w:val="es-EC"/>
-        </w:rPr>
-        <w:t xml:space="preserve"> no r</w:t>
+        <w:t>Práctica pre profesional no r</w:t>
       </w:r>
       <w:r>
         <w:rPr>
@@ -5976,7 +5954,7 @@
           <w:lang w:val="es-EC"/>
         </w:rPr>
         <w:drawing>
-          <wp:inline distT="0" distB="0" distL="0" distR="0" wp14:anchorId="58708E0A" wp14:editId="400290A0">
+          <wp:inline distT="0" distB="0" distL="0" distR="0" wp14:anchorId="58708E0A" wp14:editId="64168D9D">
             <wp:extent cx="3602383" cy="3337560"/>
             <wp:effectExtent l="0" t="0" r="0" b="0"/>
             <wp:docPr id="1607596467" name="Imagen 1"/>
@@ -6441,13 +6419,8 @@
         <w:t xml:space="preserve"> </w:t>
       </w:r>
       <w:r>
-        <w:t xml:space="preserve">Familiarización con la plataforma </w:t>
-      </w:r>
-      <w:proofErr w:type="spellStart"/>
-      <w:r>
-        <w:t>moodle</w:t>
-      </w:r>
-      <w:proofErr w:type="spellEnd"/>
+        <w:t>Familiarización con la plataforma moodle</w:t>
+      </w:r>
     </w:p>
     <w:p>
       <w:pPr>
@@ -6517,7 +6490,7 @@
           <w:noProof/>
         </w:rPr>
         <w:drawing>
-          <wp:inline distT="0" distB="0" distL="0" distR="0" wp14:anchorId="2659E65D" wp14:editId="0804ECF1">
+          <wp:inline distT="0" distB="0" distL="0" distR="0" wp14:anchorId="2659E65D" wp14:editId="32FE6286">
             <wp:extent cx="5375830" cy="2560320"/>
             <wp:effectExtent l="0" t="0" r="0" b="0"/>
             <wp:docPr id="374349723" name="Imagen 24"/>
@@ -6582,15 +6555,8 @@
         </w:r>
       </w:fldSimple>
       <w:r>
-        <w:t xml:space="preserve"> Creación de repositorio en Git </w:t>
-      </w:r>
-      <w:proofErr w:type="spellStart"/>
-      <w:proofErr w:type="gramStart"/>
-      <w:r>
-        <w:t>hub</w:t>
-      </w:r>
-      <w:proofErr w:type="spellEnd"/>
-      <w:proofErr w:type="gramEnd"/>
+        <w:t xml:space="preserve"> Creación de repositorio en Git hub</w:t>
+      </w:r>
     </w:p>
     <w:p/>
     <w:p>
@@ -6669,13 +6635,8 @@
         </w:r>
       </w:fldSimple>
       <w:r>
-        <w:t xml:space="preserve">  Instalación de </w:t>
-      </w:r>
-      <w:proofErr w:type="spellStart"/>
-      <w:r>
-        <w:t>git</w:t>
-      </w:r>
-      <w:proofErr w:type="spellEnd"/>
+        <w:t xml:space="preserve">  Instalación de git</w:t>
+      </w:r>
       <w:r>
         <w:br/>
       </w:r>
@@ -6928,15 +6889,7 @@
         </w:r>
       </w:fldSimple>
       <w:r>
-        <w:t xml:space="preserve"> Creación de </w:t>
-      </w:r>
-      <w:proofErr w:type="spellStart"/>
-      <w:r>
-        <w:t>notion</w:t>
-      </w:r>
-      <w:proofErr w:type="spellEnd"/>
-      <w:r>
-        <w:t xml:space="preserve"> para registrar progresos</w:t>
+        <w:t xml:space="preserve"> Creación de notion para registrar progresos</w:t>
       </w:r>
     </w:p>
     <w:p>
@@ -6981,9 +6934,9 @@
         </w:rPr>
         <w:lastRenderedPageBreak/>
         <w:drawing>
-          <wp:inline distT="0" distB="0" distL="0" distR="0" wp14:anchorId="6306AE9C" wp14:editId="13D4FD13">
-            <wp:extent cx="5321022" cy="2491105"/>
-            <wp:effectExtent l="0" t="0" r="0" b="4445"/>
+          <wp:inline distT="0" distB="0" distL="0" distR="0" wp14:anchorId="6306AE9C" wp14:editId="2D8257EC">
+            <wp:extent cx="3688080" cy="3531231"/>
+            <wp:effectExtent l="0" t="0" r="7620" b="0"/>
             <wp:docPr id="271527204" name="Imagen 1"/>
             <wp:cNvGraphicFramePr>
               <a:graphicFrameLocks xmlns:a="http://schemas.openxmlformats.org/drawingml/2006/main" noChangeAspect="1"/>
@@ -6996,7 +6949,7 @@
                     <pic:cNvPicPr/>
                   </pic:nvPicPr>
                   <pic:blipFill>
-                    <a:blip r:embed="rId19" cstate="print">
+                    <a:blip r:embed="rId19">
                       <a:extLst>
                         <a:ext uri="{28A0092B-C50C-407E-A947-70E740481C1C}">
                           <a14:useLocalDpi xmlns:a14="http://schemas.microsoft.com/office/drawing/2010/main" val="0"/>
@@ -7010,7 +6963,7 @@
                   <pic:spPr>
                     <a:xfrm>
                       <a:off x="0" y="0"/>
-                      <a:ext cx="5321022" cy="2491105"/>
+                      <a:ext cx="3694650" cy="3537521"/>
                     </a:xfrm>
                     <a:prstGeom prst="rect">
                       <a:avLst/>
@@ -7058,16 +7011,22 @@
         <w:keepNext/>
         <w:jc w:val="center"/>
       </w:pPr>
+    </w:p>
+    <w:p>
+      <w:pPr>
+        <w:keepNext/>
+        <w:jc w:val="center"/>
+      </w:pPr>
       <w:r>
         <w:rPr>
           <w:noProof/>
           <w:lang w:val="es-EC"/>
         </w:rPr>
         <w:drawing>
-          <wp:inline distT="0" distB="0" distL="0" distR="0" wp14:anchorId="21BC5318" wp14:editId="28565A5A">
-            <wp:extent cx="4993351" cy="2344296"/>
-            <wp:effectExtent l="0" t="0" r="0" b="0"/>
-            <wp:docPr id="839446206" name="Imagen 1"/>
+          <wp:inline distT="0" distB="0" distL="0" distR="0" wp14:anchorId="515B86A1" wp14:editId="78CB86C6">
+            <wp:extent cx="3253740" cy="3456593"/>
+            <wp:effectExtent l="0" t="0" r="3810" b="0"/>
+            <wp:docPr id="374329458" name="Imagen 1"/>
             <wp:cNvGraphicFramePr>
               <a:graphicFrameLocks xmlns:a="http://schemas.openxmlformats.org/drawingml/2006/main" noChangeAspect="1"/>
             </wp:cNvGraphicFramePr>
@@ -7075,7 +7034,7 @@
               <a:graphicData uri="http://schemas.openxmlformats.org/drawingml/2006/picture">
                 <pic:pic xmlns:pic="http://schemas.openxmlformats.org/drawingml/2006/picture">
                   <pic:nvPicPr>
-                    <pic:cNvPr id="839446206" name="Imagen 1"/>
+                    <pic:cNvPr id="374329458" name="Imagen 1"/>
                     <pic:cNvPicPr/>
                   </pic:nvPicPr>
                   <pic:blipFill>
@@ -7093,7 +7052,7 @@
                   <pic:spPr>
                     <a:xfrm>
                       <a:off x="0" y="0"/>
-                      <a:ext cx="4993351" cy="2344296"/>
+                      <a:ext cx="3260726" cy="3464015"/>
                     </a:xfrm>
                     <a:prstGeom prst="rect">
                       <a:avLst/>
@@ -7119,79 +7078,6 @@
           <w:rPr>
             <w:noProof/>
           </w:rPr>
-          <w:t>12</w:t>
-        </w:r>
-      </w:fldSimple>
-      <w:r>
-        <w:t xml:space="preserve"> Definición de etapas generales</w:t>
-      </w:r>
-    </w:p>
-    <w:p>
-      <w:pPr>
-        <w:keepNext/>
-        <w:jc w:val="center"/>
-      </w:pPr>
-      <w:r>
-        <w:rPr>
-          <w:noProof/>
-          <w:lang w:val="es-EC"/>
-        </w:rPr>
-        <w:drawing>
-          <wp:inline distT="0" distB="0" distL="0" distR="0" wp14:anchorId="515B86A1" wp14:editId="0C36AB4D">
-            <wp:extent cx="4365544" cy="2113915"/>
-            <wp:effectExtent l="0" t="0" r="0" b="635"/>
-            <wp:docPr id="374329458" name="Imagen 1"/>
-            <wp:cNvGraphicFramePr>
-              <a:graphicFrameLocks xmlns:a="http://schemas.openxmlformats.org/drawingml/2006/main" noChangeAspect="1"/>
-            </wp:cNvGraphicFramePr>
-            <a:graphic xmlns:a="http://schemas.openxmlformats.org/drawingml/2006/main">
-              <a:graphicData uri="http://schemas.openxmlformats.org/drawingml/2006/picture">
-                <pic:pic xmlns:pic="http://schemas.openxmlformats.org/drawingml/2006/picture">
-                  <pic:nvPicPr>
-                    <pic:cNvPr id="374329458" name="Imagen 1"/>
-                    <pic:cNvPicPr/>
-                  </pic:nvPicPr>
-                  <pic:blipFill>
-                    <a:blip r:embed="rId21" cstate="print">
-                      <a:extLst>
-                        <a:ext uri="{28A0092B-C50C-407E-A947-70E740481C1C}">
-                          <a14:useLocalDpi xmlns:a14="http://schemas.microsoft.com/office/drawing/2010/main" val="0"/>
-                        </a:ext>
-                      </a:extLst>
-                    </a:blip>
-                    <a:stretch>
-                      <a:fillRect/>
-                    </a:stretch>
-                  </pic:blipFill>
-                  <pic:spPr>
-                    <a:xfrm>
-                      <a:off x="0" y="0"/>
-                      <a:ext cx="4365544" cy="2113915"/>
-                    </a:xfrm>
-                    <a:prstGeom prst="rect">
-                      <a:avLst/>
-                    </a:prstGeom>
-                  </pic:spPr>
-                </pic:pic>
-              </a:graphicData>
-            </a:graphic>
-          </wp:inline>
-        </w:drawing>
-      </w:r>
-    </w:p>
-    <w:p>
-      <w:pPr>
-        <w:pStyle w:val="Descripcin"/>
-        <w:jc w:val="center"/>
-      </w:pPr>
-      <w:r>
-        <w:t xml:space="preserve">Ilustración </w:t>
-      </w:r>
-      <w:fldSimple w:instr=" SEQ Ilustración \* ARABIC ">
-        <w:r>
-          <w:rPr>
-            <w:noProof/>
-          </w:rPr>
           <w:t>13</w:t>
         </w:r>
       </w:fldSimple>
@@ -7224,7 +7110,7 @@
           <w:lang w:val="es-EC"/>
         </w:rPr>
         <w:drawing>
-          <wp:inline distT="0" distB="0" distL="0" distR="0" wp14:anchorId="637579D6" wp14:editId="66989E7C">
+          <wp:inline distT="0" distB="0" distL="0" distR="0" wp14:anchorId="637579D6" wp14:editId="7CEBAFFD">
             <wp:extent cx="5033493" cy="2416629"/>
             <wp:effectExtent l="0" t="0" r="0" b="3175"/>
             <wp:docPr id="1502525067" name="Imagen 31"/>
@@ -7241,7 +7127,7 @@
                     </pic:cNvPicPr>
                   </pic:nvPicPr>
                   <pic:blipFill>
-                    <a:blip r:embed="rId22" cstate="print">
+                    <a:blip r:embed="rId21" cstate="print">
                       <a:extLst>
                         <a:ext uri="{28A0092B-C50C-407E-A947-70E740481C1C}">
                           <a14:useLocalDpi xmlns:a14="http://schemas.microsoft.com/office/drawing/2010/main" val="0"/>
@@ -7410,7 +7296,7 @@
                     <pic:cNvPicPr/>
                   </pic:nvPicPr>
                   <pic:blipFill>
-                    <a:blip r:embed="rId23"/>
+                    <a:blip r:embed="rId22"/>
                     <a:stretch>
                       <a:fillRect/>
                     </a:stretch>
@@ -7470,9 +7356,9 @@
         </w:rPr>
         <w:lastRenderedPageBreak/>
         <w:drawing>
-          <wp:inline distT="0" distB="0" distL="0" distR="0" wp14:anchorId="6437D2FB" wp14:editId="6F02A493">
-            <wp:extent cx="4061460" cy="3744907"/>
-            <wp:effectExtent l="0" t="0" r="0" b="8255"/>
+          <wp:inline distT="0" distB="0" distL="0" distR="0" wp14:anchorId="6437D2FB" wp14:editId="75674FA6">
+            <wp:extent cx="4064712" cy="3747905"/>
+            <wp:effectExtent l="0" t="0" r="0" b="5080"/>
             <wp:docPr id="1291368549" name="Imagen 1"/>
             <wp:cNvGraphicFramePr>
               <a:graphicFrameLocks xmlns:a="http://schemas.openxmlformats.org/drawingml/2006/main" noChangeAspect="1"/>
@@ -7481,12 +7367,18 @@
               <a:graphicData uri="http://schemas.openxmlformats.org/drawingml/2006/picture">
                 <pic:pic xmlns:pic="http://schemas.openxmlformats.org/drawingml/2006/picture">
                   <pic:nvPicPr>
-                    <pic:cNvPr id="1291368549" name=""/>
+                    <pic:cNvPr id="1291368549" name="Imagen 1"/>
                     <pic:cNvPicPr/>
                   </pic:nvPicPr>
-                  <pic:blipFill rotWithShape="1">
-                    <a:blip r:embed="rId24"/>
-                    <a:srcRect b="1911"/>
+                  <pic:blipFill>
+                    <a:blip r:embed="rId23">
+                      <a:extLst>
+                        <a:ext uri="{28A0092B-C50C-407E-A947-70E740481C1C}">
+                          <a14:useLocalDpi xmlns:a14="http://schemas.microsoft.com/office/drawing/2010/main" val="0"/>
+                        </a:ext>
+                      </a:extLst>
+                    </a:blip>
+                    <a:srcRect l="2618" r="2618"/>
                     <a:stretch>
                       <a:fillRect/>
                     </a:stretch>
@@ -7576,7 +7468,7 @@
           <w:noProof/>
         </w:rPr>
         <w:drawing>
-          <wp:inline distT="0" distB="0" distL="0" distR="0" wp14:anchorId="5DBA9331" wp14:editId="59FD5451">
+          <wp:inline distT="0" distB="0" distL="0" distR="0" wp14:anchorId="5DBA9331" wp14:editId="17679C81">
             <wp:extent cx="3853501" cy="1871796"/>
             <wp:effectExtent l="0" t="0" r="0" b="0"/>
             <wp:docPr id="104674412" name="Imagen 1"/>
@@ -7591,7 +7483,7 @@
                     <pic:cNvPicPr/>
                   </pic:nvPicPr>
                   <pic:blipFill>
-                    <a:blip r:embed="rId25" cstate="print">
+                    <a:blip r:embed="rId24" cstate="print">
                       <a:extLst>
                         <a:ext uri="{28A0092B-C50C-407E-A947-70E740481C1C}">
                           <a14:useLocalDpi xmlns:a14="http://schemas.microsoft.com/office/drawing/2010/main" val="0"/>
@@ -7663,7 +7555,7 @@
                     <pic:cNvPicPr/>
                   </pic:nvPicPr>
                   <pic:blipFill>
-                    <a:blip r:embed="rId26" cstate="print">
+                    <a:blip r:embed="rId25" cstate="print">
                       <a:extLst>
                         <a:ext uri="{28A0092B-C50C-407E-A947-70E740481C1C}">
                           <a14:useLocalDpi xmlns:a14="http://schemas.microsoft.com/office/drawing/2010/main" val="0"/>
@@ -7707,13 +7599,8 @@
         </w:r>
       </w:fldSimple>
       <w:r>
-        <w:t xml:space="preserve"> Requisitos funcionales en </w:t>
-      </w:r>
-      <w:proofErr w:type="spellStart"/>
-      <w:r>
-        <w:t>notion</w:t>
-      </w:r>
-      <w:proofErr w:type="spellEnd"/>
+        <w:t xml:space="preserve"> Requisitos funcionales en notion</w:t>
+      </w:r>
     </w:p>
     <w:p>
       <w:pPr>
@@ -7754,6 +7641,9 @@
         <w:keepNext/>
       </w:pPr>
       <w:r>
+        <w:rPr>
+          <w:noProof/>
+        </w:rPr>
         <w:drawing>
           <wp:inline distT="0" distB="0" distL="0" distR="0" wp14:anchorId="7729984D" wp14:editId="60DE7C3A">
             <wp:extent cx="5760085" cy="1688465"/>
@@ -7770,7 +7660,7 @@
                     <pic:cNvPicPr/>
                   </pic:nvPicPr>
                   <pic:blipFill>
-                    <a:blip r:embed="rId27"/>
+                    <a:blip r:embed="rId26"/>
                     <a:stretch>
                       <a:fillRect/>
                     </a:stretch>
@@ -7816,6 +7706,9 @@
         <w:keepNext/>
       </w:pPr>
       <w:r>
+        <w:rPr>
+          <w:noProof/>
+        </w:rPr>
         <w:drawing>
           <wp:inline distT="0" distB="0" distL="0" distR="0" wp14:anchorId="0D8A5F0B" wp14:editId="138C9920">
             <wp:extent cx="5148470" cy="2422409"/>
@@ -7832,7 +7725,7 @@
                     <pic:cNvPicPr/>
                   </pic:nvPicPr>
                   <pic:blipFill>
-                    <a:blip r:embed="rId28"/>
+                    <a:blip r:embed="rId27"/>
                     <a:stretch>
                       <a:fillRect/>
                     </a:stretch>
@@ -7870,13 +7763,8 @@
         </w:r>
       </w:fldSimple>
       <w:r>
-        <w:t xml:space="preserve"> Requisitos funcionales en </w:t>
-      </w:r>
-      <w:proofErr w:type="spellStart"/>
-      <w:r>
-        <w:t>notion</w:t>
-      </w:r>
-      <w:proofErr w:type="spellEnd"/>
+        <w:t xml:space="preserve"> Requisitos funcionales en notion</w:t>
+      </w:r>
     </w:p>
     <w:p>
       <w:pPr>
@@ -9076,8 +8964,8 @@
       </w:pPr>
     </w:p>
     <w:sectPr>
-      <w:headerReference w:type="default" r:id="rId29"/>
-      <w:footerReference w:type="default" r:id="rId30"/>
+      <w:headerReference w:type="default" r:id="rId28"/>
+      <w:footerReference w:type="default" r:id="rId29"/>
       <w:pgSz w:w="11906" w:h="16838"/>
       <w:pgMar w:top="1418" w:right="1134" w:bottom="1418" w:left="1701" w:header="709" w:footer="709" w:gutter="0"/>
       <w:cols w:space="708"/>
@@ -9149,27 +9037,7 @@
         <w:sz w:val="14"/>
         <w:szCs w:val="14"/>
       </w:rPr>
-      <w:t xml:space="preserve"> </w:t>
-    </w:r>
-    <w:proofErr w:type="spellStart"/>
-    <w:r>
-      <w:rPr>
-        <w:rFonts w:asciiTheme="majorHAnsi" w:hAnsiTheme="majorHAnsi" w:cs="Arial"/>
-        <w:b/>
-        <w:sz w:val="14"/>
-        <w:szCs w:val="14"/>
-      </w:rPr>
-      <w:t>N°</w:t>
-    </w:r>
-    <w:proofErr w:type="spellEnd"/>
-    <w:r>
-      <w:rPr>
-        <w:rFonts w:asciiTheme="majorHAnsi" w:hAnsiTheme="majorHAnsi" w:cs="Arial"/>
-        <w:b/>
-        <w:sz w:val="14"/>
-        <w:szCs w:val="14"/>
-      </w:rPr>
-      <w:t xml:space="preserve"> </w:t>
+      <w:t xml:space="preserve"> N° </w:t>
     </w:r>
     <w:r>
       <w:rPr>

</xml_diff>

<commit_message>
Evidencias 24 de septiembre
</commit_message>
<xml_diff>
--- a/Evidencias/2. Evidencias_PPP_Ayo.docx
+++ b/Evidencias/2. Evidencias_PPP_Ayo.docx
@@ -758,7 +758,29 @@
           <w:szCs w:val="18"/>
           <w:lang w:val="es-EC"/>
         </w:rPr>
-        <w:t>Práctica pre profesional no r</w:t>
+        <w:t xml:space="preserve">Práctica </w:t>
+      </w:r>
+      <w:proofErr w:type="gramStart"/>
+      <w:r>
+        <w:rPr>
+          <w:rFonts w:ascii="Times New Roman" w:hAnsi="Times New Roman"/>
+          <w:b/>
+          <w:sz w:val="18"/>
+          <w:szCs w:val="18"/>
+          <w:lang w:val="es-EC"/>
+        </w:rPr>
+        <w:t>pre profesional</w:t>
+      </w:r>
+      <w:proofErr w:type="gramEnd"/>
+      <w:r>
+        <w:rPr>
+          <w:rFonts w:ascii="Times New Roman" w:hAnsi="Times New Roman"/>
+          <w:b/>
+          <w:sz w:val="18"/>
+          <w:szCs w:val="18"/>
+          <w:lang w:val="es-EC"/>
+        </w:rPr>
+        <w:t xml:space="preserve"> no r</w:t>
       </w:r>
       <w:r>
         <w:rPr>
@@ -6419,8 +6441,13 @@
         <w:t xml:space="preserve"> </w:t>
       </w:r>
       <w:r>
-        <w:t>Familiarización con la plataforma moodle</w:t>
-      </w:r>
+        <w:t xml:space="preserve">Familiarización con la plataforma </w:t>
+      </w:r>
+      <w:proofErr w:type="spellStart"/>
+      <w:r>
+        <w:t>moodle</w:t>
+      </w:r>
+      <w:proofErr w:type="spellEnd"/>
     </w:p>
     <w:p>
       <w:pPr>
@@ -6555,8 +6582,15 @@
         </w:r>
       </w:fldSimple>
       <w:r>
-        <w:t xml:space="preserve"> Creación de repositorio en Git hub</w:t>
-      </w:r>
+        <w:t xml:space="preserve"> Creación de repositorio en Git </w:t>
+      </w:r>
+      <w:proofErr w:type="spellStart"/>
+      <w:proofErr w:type="gramStart"/>
+      <w:r>
+        <w:t>hub</w:t>
+      </w:r>
+      <w:proofErr w:type="spellEnd"/>
+      <w:proofErr w:type="gramEnd"/>
     </w:p>
     <w:p/>
     <w:p>
@@ -6635,8 +6669,13 @@
         </w:r>
       </w:fldSimple>
       <w:r>
-        <w:t xml:space="preserve">  Instalación de git</w:t>
-      </w:r>
+        <w:t xml:space="preserve">  Instalación de </w:t>
+      </w:r>
+      <w:proofErr w:type="spellStart"/>
+      <w:r>
+        <w:t>git</w:t>
+      </w:r>
+      <w:proofErr w:type="spellEnd"/>
       <w:r>
         <w:br/>
       </w:r>
@@ -6889,7 +6928,15 @@
         </w:r>
       </w:fldSimple>
       <w:r>
-        <w:t xml:space="preserve"> Creación de notion para registrar progresos</w:t>
+        <w:t xml:space="preserve"> Creación de </w:t>
+      </w:r>
+      <w:proofErr w:type="spellStart"/>
+      <w:r>
+        <w:t>notion</w:t>
+      </w:r>
+      <w:proofErr w:type="spellEnd"/>
+      <w:r>
+        <w:t xml:space="preserve"> para registrar progresos</w:t>
       </w:r>
     </w:p>
     <w:p>
@@ -7078,7 +7125,7 @@
           <w:rPr>
             <w:noProof/>
           </w:rPr>
-          <w:t>13</w:t>
+          <w:t>12</w:t>
         </w:r>
       </w:fldSimple>
       <w:r>
@@ -7171,7 +7218,7 @@
           <w:rPr>
             <w:noProof/>
           </w:rPr>
-          <w:t>14</w:t>
+          <w:t>13</w:t>
         </w:r>
       </w:fldSimple>
       <w:r>
@@ -7330,7 +7377,7 @@
           <w:rPr>
             <w:noProof/>
           </w:rPr>
-          <w:t>15</w:t>
+          <w:t>14</w:t>
         </w:r>
       </w:fldSimple>
       <w:r>
@@ -7420,7 +7467,7 @@
           <w:rPr>
             <w:noProof/>
           </w:rPr>
-          <w:t>16</w:t>
+          <w:t>15</w:t>
         </w:r>
       </w:fldSimple>
       <w:r>
@@ -7523,7 +7570,7 @@
           <w:rPr>
             <w:noProof/>
           </w:rPr>
-          <w:t>17</w:t>
+          <w:t>16</w:t>
         </w:r>
       </w:fldSimple>
       <w:r>
@@ -7595,12 +7642,17 @@
           <w:rPr>
             <w:noProof/>
           </w:rPr>
-          <w:t>18</w:t>
+          <w:t>17</w:t>
         </w:r>
       </w:fldSimple>
       <w:r>
-        <w:t xml:space="preserve"> Requisitos funcionales en notion</w:t>
-      </w:r>
+        <w:t xml:space="preserve"> Requisitos funcionales en </w:t>
+      </w:r>
+      <w:proofErr w:type="spellStart"/>
+      <w:r>
+        <w:t>notion</w:t>
+      </w:r>
+      <w:proofErr w:type="spellEnd"/>
     </w:p>
     <w:p>
       <w:pPr>
@@ -7694,7 +7746,7 @@
           <w:rPr>
             <w:noProof/>
           </w:rPr>
-          <w:t>19</w:t>
+          <w:t>18</w:t>
         </w:r>
       </w:fldSimple>
       <w:r>
@@ -7759,12 +7811,17 @@
           <w:rPr>
             <w:noProof/>
           </w:rPr>
-          <w:t>20</w:t>
+          <w:t>19</w:t>
         </w:r>
       </w:fldSimple>
       <w:r>
-        <w:t xml:space="preserve"> Requisitos funcionales en notion</w:t>
-      </w:r>
+        <w:t xml:space="preserve"> Requisitos funcionales en </w:t>
+      </w:r>
+      <w:proofErr w:type="spellStart"/>
+      <w:r>
+        <w:t>notion</w:t>
+      </w:r>
+      <w:proofErr w:type="spellEnd"/>
     </w:p>
     <w:p>
       <w:pPr>
@@ -7817,6 +7874,220 @@
     </w:p>
     <w:p>
       <w:pPr>
+        <w:rPr>
+          <w:lang w:val="es-EC"/>
+        </w:rPr>
+      </w:pPr>
+    </w:p>
+    <w:p>
+      <w:pPr>
+        <w:keepNext/>
+      </w:pPr>
+      <w:r>
+        <w:rPr>
+          <w:lang w:val="es-EC"/>
+        </w:rPr>
+        <w:drawing>
+          <wp:inline distT="0" distB="0" distL="0" distR="0" wp14:anchorId="699CFC87" wp14:editId="019310D4">
+            <wp:extent cx="5760085" cy="2156460"/>
+            <wp:effectExtent l="0" t="0" r="0" b="0"/>
+            <wp:docPr id="1396477645" name="Imagen 1"/>
+            <wp:cNvGraphicFramePr>
+              <a:graphicFrameLocks xmlns:a="http://schemas.openxmlformats.org/drawingml/2006/main" noChangeAspect="1"/>
+            </wp:cNvGraphicFramePr>
+            <a:graphic xmlns:a="http://schemas.openxmlformats.org/drawingml/2006/main">
+              <a:graphicData uri="http://schemas.openxmlformats.org/drawingml/2006/picture">
+                <pic:pic xmlns:pic="http://schemas.openxmlformats.org/drawingml/2006/picture">
+                  <pic:nvPicPr>
+                    <pic:cNvPr id="1396477645" name=""/>
+                    <pic:cNvPicPr/>
+                  </pic:nvPicPr>
+                  <pic:blipFill>
+                    <a:blip r:embed="rId28"/>
+                    <a:stretch>
+                      <a:fillRect/>
+                    </a:stretch>
+                  </pic:blipFill>
+                  <pic:spPr>
+                    <a:xfrm>
+                      <a:off x="0" y="0"/>
+                      <a:ext cx="5760085" cy="2156460"/>
+                    </a:xfrm>
+                    <a:prstGeom prst="rect">
+                      <a:avLst/>
+                    </a:prstGeom>
+                  </pic:spPr>
+                </pic:pic>
+              </a:graphicData>
+            </a:graphic>
+          </wp:inline>
+        </w:drawing>
+      </w:r>
+    </w:p>
+    <w:p>
+      <w:pPr>
+        <w:pStyle w:val="Descripcin"/>
+        <w:jc w:val="center"/>
+      </w:pPr>
+      <w:r>
+        <w:t xml:space="preserve">Ilustración </w:t>
+      </w:r>
+      <w:fldSimple w:instr=" SEQ Ilustración \* ARABIC ">
+        <w:r>
+          <w:rPr>
+            <w:noProof/>
+          </w:rPr>
+          <w:t>20</w:t>
+        </w:r>
+      </w:fldSimple>
+      <w:r>
+        <w:t xml:space="preserve"> Matriz de requisitos para integración con Moodle</w:t>
+      </w:r>
+    </w:p>
+    <w:p/>
+    <w:p>
+      <w:pPr>
+        <w:keepNext/>
+      </w:pPr>
+      <w:r>
+        <w:rPr>
+          <w:lang w:val="es-EC"/>
+        </w:rPr>
+        <w:drawing>
+          <wp:inline distT="0" distB="0" distL="0" distR="0" wp14:anchorId="5837B85F" wp14:editId="21203EA9">
+            <wp:extent cx="5760085" cy="2407285"/>
+            <wp:effectExtent l="0" t="0" r="0" b="0"/>
+            <wp:docPr id="1868518451" name="Imagen 1"/>
+            <wp:cNvGraphicFramePr>
+              <a:graphicFrameLocks xmlns:a="http://schemas.openxmlformats.org/drawingml/2006/main" noChangeAspect="1"/>
+            </wp:cNvGraphicFramePr>
+            <a:graphic xmlns:a="http://schemas.openxmlformats.org/drawingml/2006/main">
+              <a:graphicData uri="http://schemas.openxmlformats.org/drawingml/2006/picture">
+                <pic:pic xmlns:pic="http://schemas.openxmlformats.org/drawingml/2006/picture">
+                  <pic:nvPicPr>
+                    <pic:cNvPr id="1868518451" name=""/>
+                    <pic:cNvPicPr/>
+                  </pic:nvPicPr>
+                  <pic:blipFill>
+                    <a:blip r:embed="rId29"/>
+                    <a:stretch>
+                      <a:fillRect/>
+                    </a:stretch>
+                  </pic:blipFill>
+                  <pic:spPr>
+                    <a:xfrm>
+                      <a:off x="0" y="0"/>
+                      <a:ext cx="5760085" cy="2407285"/>
+                    </a:xfrm>
+                    <a:prstGeom prst="rect">
+                      <a:avLst/>
+                    </a:prstGeom>
+                  </pic:spPr>
+                </pic:pic>
+              </a:graphicData>
+            </a:graphic>
+          </wp:inline>
+        </w:drawing>
+      </w:r>
+    </w:p>
+    <w:p>
+      <w:pPr>
+        <w:pStyle w:val="Descripcin"/>
+        <w:jc w:val="center"/>
+      </w:pPr>
+      <w:r>
+        <w:t xml:space="preserve">Ilustración </w:t>
+      </w:r>
+      <w:fldSimple w:instr=" SEQ Ilustración \* ARABIC ">
+        <w:r>
+          <w:rPr>
+            <w:noProof/>
+          </w:rPr>
+          <w:t>21</w:t>
+        </w:r>
+      </w:fldSimple>
+      <w:r>
+        <w:t xml:space="preserve"> Matriz de requisitos de seguridad, privacidad y acceso</w:t>
+      </w:r>
+    </w:p>
+    <w:p>
+      <w:pPr>
+        <w:rPr>
+          <w:lang w:val="es-EC"/>
+        </w:rPr>
+      </w:pPr>
+    </w:p>
+    <w:p>
+      <w:pPr>
+        <w:keepNext/>
+      </w:pPr>
+      <w:r>
+        <w:rPr>
+          <w:lang w:val="es-EC"/>
+        </w:rPr>
+        <w:lastRenderedPageBreak/>
+        <w:drawing>
+          <wp:inline distT="0" distB="0" distL="0" distR="0" wp14:anchorId="73BFC1CC" wp14:editId="31F46F88">
+            <wp:extent cx="5760085" cy="3042285"/>
+            <wp:effectExtent l="0" t="0" r="0" b="5715"/>
+            <wp:docPr id="149239943" name="Imagen 1"/>
+            <wp:cNvGraphicFramePr>
+              <a:graphicFrameLocks xmlns:a="http://schemas.openxmlformats.org/drawingml/2006/main" noChangeAspect="1"/>
+            </wp:cNvGraphicFramePr>
+            <a:graphic xmlns:a="http://schemas.openxmlformats.org/drawingml/2006/main">
+              <a:graphicData uri="http://schemas.openxmlformats.org/drawingml/2006/picture">
+                <pic:pic xmlns:pic="http://schemas.openxmlformats.org/drawingml/2006/picture">
+                  <pic:nvPicPr>
+                    <pic:cNvPr id="149239943" name=""/>
+                    <pic:cNvPicPr/>
+                  </pic:nvPicPr>
+                  <pic:blipFill>
+                    <a:blip r:embed="rId30"/>
+                    <a:stretch>
+                      <a:fillRect/>
+                    </a:stretch>
+                  </pic:blipFill>
+                  <pic:spPr>
+                    <a:xfrm>
+                      <a:off x="0" y="0"/>
+                      <a:ext cx="5760085" cy="3042285"/>
+                    </a:xfrm>
+                    <a:prstGeom prst="rect">
+                      <a:avLst/>
+                    </a:prstGeom>
+                  </pic:spPr>
+                </pic:pic>
+              </a:graphicData>
+            </a:graphic>
+          </wp:inline>
+        </w:drawing>
+      </w:r>
+    </w:p>
+    <w:p>
+      <w:pPr>
+        <w:pStyle w:val="Descripcin"/>
+        <w:jc w:val="center"/>
+        <w:rPr>
+          <w:lang w:val="es-EC"/>
+        </w:rPr>
+      </w:pPr>
+      <w:r>
+        <w:t xml:space="preserve">Ilustración </w:t>
+      </w:r>
+      <w:fldSimple w:instr=" SEQ Ilustración \* ARABIC ">
+        <w:r>
+          <w:rPr>
+            <w:noProof/>
+          </w:rPr>
+          <w:t>22</w:t>
+        </w:r>
+      </w:fldSimple>
+      <w:r>
+        <w:t xml:space="preserve"> Matriz de requisitos no funcionales</w:t>
+      </w:r>
+    </w:p>
+    <w:p>
+      <w:pPr>
         <w:pStyle w:val="Ttulo1"/>
         <w:numPr>
           <w:ilvl w:val="0"/>
@@ -7843,6 +8114,7 @@
           <w:szCs w:val="22"/>
           <w:lang w:val="es-EC"/>
         </w:rPr>
+        <w:lastRenderedPageBreak/>
         <w:t>25 de septiembre de 2026</w:t>
       </w:r>
       <w:bookmarkEnd w:id="9"/>
@@ -8731,7 +9003,6 @@
           <w:szCs w:val="22"/>
           <w:lang w:val="es-EC"/>
         </w:rPr>
-        <w:lastRenderedPageBreak/>
         <w:t>30 de octubre de 2026</w:t>
       </w:r>
       <w:bookmarkEnd w:id="33"/>
@@ -8796,6 +9067,7 @@
           <w:szCs w:val="22"/>
           <w:lang w:val="es-EC"/>
         </w:rPr>
+        <w:lastRenderedPageBreak/>
         <w:t>5 de noviembre de 2026</w:t>
       </w:r>
       <w:bookmarkEnd w:id="35"/>
@@ -8964,8 +9236,8 @@
       </w:pPr>
     </w:p>
     <w:sectPr>
-      <w:headerReference w:type="default" r:id="rId28"/>
-      <w:footerReference w:type="default" r:id="rId29"/>
+      <w:headerReference w:type="default" r:id="rId31"/>
+      <w:footerReference w:type="default" r:id="rId32"/>
       <w:pgSz w:w="11906" w:h="16838"/>
       <w:pgMar w:top="1418" w:right="1134" w:bottom="1418" w:left="1701" w:header="709" w:footer="709" w:gutter="0"/>
       <w:cols w:space="708"/>
@@ -9037,7 +9309,27 @@
         <w:sz w:val="14"/>
         <w:szCs w:val="14"/>
       </w:rPr>
-      <w:t xml:space="preserve"> N° </w:t>
+      <w:t xml:space="preserve"> </w:t>
+    </w:r>
+    <w:proofErr w:type="spellStart"/>
+    <w:r>
+      <w:rPr>
+        <w:rFonts w:asciiTheme="majorHAnsi" w:hAnsiTheme="majorHAnsi" w:cs="Arial"/>
+        <w:b/>
+        <w:sz w:val="14"/>
+        <w:szCs w:val="14"/>
+      </w:rPr>
+      <w:t>N°</w:t>
+    </w:r>
+    <w:proofErr w:type="spellEnd"/>
+    <w:r>
+      <w:rPr>
+        <w:rFonts w:asciiTheme="majorHAnsi" w:hAnsiTheme="majorHAnsi" w:cs="Arial"/>
+        <w:b/>
+        <w:sz w:val="14"/>
+        <w:szCs w:val="14"/>
+      </w:rPr>
+      <w:t xml:space="preserve"> </w:t>
     </w:r>
     <w:r>
       <w:rPr>

</xml_diff>

<commit_message>
Evidencias del 25 de septiembre
</commit_message>
<xml_diff>
--- a/Evidencias/2. Evidencias_PPP_Ayo.docx
+++ b/Evidencias/2. Evidencias_PPP_Ayo.docx
@@ -758,29 +758,7 @@
           <w:szCs w:val="18"/>
           <w:lang w:val="es-EC"/>
         </w:rPr>
-        <w:t xml:space="preserve">Práctica </w:t>
-      </w:r>
-      <w:proofErr w:type="gramStart"/>
-      <w:r>
-        <w:rPr>
-          <w:rFonts w:ascii="Times New Roman" w:hAnsi="Times New Roman"/>
-          <w:b/>
-          <w:sz w:val="18"/>
-          <w:szCs w:val="18"/>
-          <w:lang w:val="es-EC"/>
-        </w:rPr>
-        <w:t>pre profesional</w:t>
-      </w:r>
-      <w:proofErr w:type="gramEnd"/>
-      <w:r>
-        <w:rPr>
-          <w:rFonts w:ascii="Times New Roman" w:hAnsi="Times New Roman"/>
-          <w:b/>
-          <w:sz w:val="18"/>
-          <w:szCs w:val="18"/>
-          <w:lang w:val="es-EC"/>
-        </w:rPr>
-        <w:t xml:space="preserve"> no r</w:t>
+        <w:t>Práctica pre profesional no r</w:t>
       </w:r>
       <w:r>
         <w:rPr>
@@ -5976,7 +5954,7 @@
           <w:lang w:val="es-EC"/>
         </w:rPr>
         <w:drawing>
-          <wp:inline distT="0" distB="0" distL="0" distR="0" wp14:anchorId="58708E0A" wp14:editId="64168D9D">
+          <wp:inline distT="0" distB="0" distL="0" distR="0" wp14:anchorId="58708E0A" wp14:editId="4F7727BA">
             <wp:extent cx="3602383" cy="3337560"/>
             <wp:effectExtent l="0" t="0" r="0" b="0"/>
             <wp:docPr id="1607596467" name="Imagen 1"/>
@@ -6517,7 +6495,7 @@
           <w:noProof/>
         </w:rPr>
         <w:drawing>
-          <wp:inline distT="0" distB="0" distL="0" distR="0" wp14:anchorId="2659E65D" wp14:editId="32FE6286">
+          <wp:inline distT="0" distB="0" distL="0" distR="0" wp14:anchorId="2659E65D" wp14:editId="3CD84260">
             <wp:extent cx="5375830" cy="2560320"/>
             <wp:effectExtent l="0" t="0" r="0" b="0"/>
             <wp:docPr id="374349723" name="Imagen 24"/>
@@ -6585,12 +6563,10 @@
         <w:t xml:space="preserve"> Creación de repositorio en Git </w:t>
       </w:r>
       <w:proofErr w:type="spellStart"/>
-      <w:proofErr w:type="gramStart"/>
       <w:r>
         <w:t>hub</w:t>
       </w:r>
       <w:proofErr w:type="spellEnd"/>
-      <w:proofErr w:type="gramEnd"/>
     </w:p>
     <w:p/>
     <w:p>
@@ -7070,7 +7046,7 @@
           <w:lang w:val="es-EC"/>
         </w:rPr>
         <w:drawing>
-          <wp:inline distT="0" distB="0" distL="0" distR="0" wp14:anchorId="515B86A1" wp14:editId="78CB86C6">
+          <wp:inline distT="0" distB="0" distL="0" distR="0" wp14:anchorId="515B86A1" wp14:editId="3C69AB2A">
             <wp:extent cx="3253740" cy="3456593"/>
             <wp:effectExtent l="0" t="0" r="3810" b="0"/>
             <wp:docPr id="374329458" name="Imagen 1"/>
@@ -7157,7 +7133,7 @@
           <w:lang w:val="es-EC"/>
         </w:rPr>
         <w:drawing>
-          <wp:inline distT="0" distB="0" distL="0" distR="0" wp14:anchorId="637579D6" wp14:editId="7CEBAFFD">
+          <wp:inline distT="0" distB="0" distL="0" distR="0" wp14:anchorId="637579D6" wp14:editId="4192EBB7">
             <wp:extent cx="5033493" cy="2416629"/>
             <wp:effectExtent l="0" t="0" r="0" b="3175"/>
             <wp:docPr id="1502525067" name="Imagen 31"/>
@@ -7515,7 +7491,7 @@
           <w:noProof/>
         </w:rPr>
         <w:drawing>
-          <wp:inline distT="0" distB="0" distL="0" distR="0" wp14:anchorId="5DBA9331" wp14:editId="17679C81">
+          <wp:inline distT="0" distB="0" distL="0" distR="0" wp14:anchorId="5DBA9331" wp14:editId="7E168901">
             <wp:extent cx="3853501" cy="1871796"/>
             <wp:effectExtent l="0" t="0" r="0" b="0"/>
             <wp:docPr id="104674412" name="Imagen 1"/>
@@ -7885,6 +7861,7 @@
       </w:pPr>
       <w:r>
         <w:rPr>
+          <w:noProof/>
           <w:lang w:val="es-EC"/>
         </w:rPr>
         <w:drawing>
@@ -7951,6 +7928,7 @@
       </w:pPr>
       <w:r>
         <w:rPr>
+          <w:noProof/>
           <w:lang w:val="es-EC"/>
         </w:rPr>
         <w:drawing>
@@ -8023,6 +8001,7 @@
       </w:pPr>
       <w:r>
         <w:rPr>
+          <w:noProof/>
           <w:lang w:val="es-EC"/>
         </w:rPr>
         <w:lastRenderedPageBreak/>
@@ -8089,10 +8068,7 @@
     <w:p>
       <w:pPr>
         <w:pStyle w:val="Ttulo1"/>
-        <w:numPr>
-          <w:ilvl w:val="0"/>
-          <w:numId w:val="3"/>
-        </w:numPr>
+        <w:ind w:left="720"/>
         <w:rPr>
           <w:rFonts w:ascii="Times New Roman" w:hAnsi="Times New Roman" w:cs="Times New Roman"/>
           <w:b/>
@@ -8114,10 +8090,354 @@
           <w:szCs w:val="22"/>
           <w:lang w:val="es-EC"/>
         </w:rPr>
+        <w:t>25 de septiembre de 2026</w:t>
+      </w:r>
+      <w:bookmarkEnd w:id="9"/>
+      <w:r>
+        <w:rPr>
+          <w:rFonts w:ascii="Times New Roman" w:hAnsi="Times New Roman" w:cs="Times New Roman"/>
+          <w:b/>
+          <w:bCs/>
+          <w:color w:val="auto"/>
+          <w:sz w:val="22"/>
+          <w:szCs w:val="22"/>
+          <w:lang w:val="es-EC"/>
+        </w:rPr>
+        <w:br/>
+      </w:r>
+    </w:p>
+    <w:p>
+      <w:pPr>
+        <w:pStyle w:val="Ttulo1"/>
+        <w:ind w:left="720"/>
+      </w:pPr>
+      <w:r>
+        <w:rPr>
+          <w:rFonts w:ascii="Times New Roman" w:hAnsi="Times New Roman" w:cs="Times New Roman"/>
+          <w:b/>
+          <w:bCs/>
+          <w:color w:val="auto"/>
+          <w:sz w:val="22"/>
+          <w:szCs w:val="22"/>
+          <w:lang w:val="es-EC"/>
+        </w:rPr>
+        <w:drawing>
+          <wp:inline distT="0" distB="0" distL="0" distR="0" wp14:anchorId="35338545" wp14:editId="74F1BCDD">
+            <wp:extent cx="5760085" cy="1964690"/>
+            <wp:effectExtent l="0" t="0" r="0" b="0"/>
+            <wp:docPr id="921987452" name="Imagen 1"/>
+            <wp:cNvGraphicFramePr>
+              <a:graphicFrameLocks xmlns:a="http://schemas.openxmlformats.org/drawingml/2006/main" noChangeAspect="1"/>
+            </wp:cNvGraphicFramePr>
+            <a:graphic xmlns:a="http://schemas.openxmlformats.org/drawingml/2006/main">
+              <a:graphicData uri="http://schemas.openxmlformats.org/drawingml/2006/picture">
+                <pic:pic xmlns:pic="http://schemas.openxmlformats.org/drawingml/2006/picture">
+                  <pic:nvPicPr>
+                    <pic:cNvPr id="921987452" name=""/>
+                    <pic:cNvPicPr/>
+                  </pic:nvPicPr>
+                  <pic:blipFill>
+                    <a:blip r:embed="rId31"/>
+                    <a:stretch>
+                      <a:fillRect/>
+                    </a:stretch>
+                  </pic:blipFill>
+                  <pic:spPr>
+                    <a:xfrm>
+                      <a:off x="0" y="0"/>
+                      <a:ext cx="5760085" cy="1964690"/>
+                    </a:xfrm>
+                    <a:prstGeom prst="rect">
+                      <a:avLst/>
+                    </a:prstGeom>
+                  </pic:spPr>
+                </pic:pic>
+              </a:graphicData>
+            </a:graphic>
+          </wp:inline>
+        </w:drawing>
+      </w:r>
+    </w:p>
+    <w:p>
+      <w:pPr>
+        <w:pStyle w:val="Descripcin"/>
+        <w:jc w:val="center"/>
+      </w:pPr>
+      <w:r>
+        <w:t xml:space="preserve">Ilustración </w:t>
+      </w:r>
+      <w:fldSimple w:instr=" SEQ Ilustración \* ARABIC ">
+        <w:r>
+          <w:rPr>
+            <w:noProof/>
+          </w:rPr>
+          <w:t>23</w:t>
+        </w:r>
+      </w:fldSimple>
+      <w:r>
+        <w:t xml:space="preserve"> Depuración de requisitos</w:t>
+      </w:r>
+    </w:p>
+    <w:p>
+      <w:pPr>
+        <w:pStyle w:val="Ttulo1"/>
+        <w:ind w:left="720"/>
+        <w:rPr>
+          <w:rFonts w:ascii="Times New Roman" w:hAnsi="Times New Roman" w:cs="Times New Roman"/>
+          <w:b/>
+          <w:bCs/>
+          <w:color w:val="auto"/>
+          <w:sz w:val="22"/>
+          <w:szCs w:val="22"/>
+          <w:lang w:val="es-EC"/>
+        </w:rPr>
+      </w:pPr>
+      <w:r>
+        <w:rPr>
+          <w:rFonts w:ascii="Times New Roman" w:hAnsi="Times New Roman" w:cs="Times New Roman"/>
+          <w:b/>
+          <w:bCs/>
+          <w:color w:val="auto"/>
+          <w:sz w:val="22"/>
+          <w:szCs w:val="22"/>
+          <w:lang w:val="es-EC"/>
+        </w:rPr>
         <w:lastRenderedPageBreak/>
-        <w:t>25 de septiembre de 2026</w:t>
-      </w:r>
-      <w:bookmarkEnd w:id="9"/>
+        <w:br/>
+      </w:r>
+    </w:p>
+    <w:p>
+      <w:pPr>
+        <w:pStyle w:val="Ttulo1"/>
+        <w:ind w:left="720"/>
+      </w:pPr>
+      <w:r>
+        <w:rPr>
+          <w:rFonts w:ascii="Times New Roman" w:hAnsi="Times New Roman" w:cs="Times New Roman"/>
+          <w:b/>
+          <w:bCs/>
+          <w:color w:val="auto"/>
+          <w:sz w:val="22"/>
+          <w:szCs w:val="22"/>
+          <w:lang w:val="es-EC"/>
+        </w:rPr>
+        <w:drawing>
+          <wp:inline distT="0" distB="0" distL="0" distR="0" wp14:anchorId="67ECF2F4" wp14:editId="5652BDE8">
+            <wp:extent cx="4765963" cy="2103755"/>
+            <wp:effectExtent l="0" t="0" r="0" b="0"/>
+            <wp:docPr id="287515609" name="Imagen 1"/>
+            <wp:cNvGraphicFramePr>
+              <a:graphicFrameLocks xmlns:a="http://schemas.openxmlformats.org/drawingml/2006/main" noChangeAspect="1"/>
+            </wp:cNvGraphicFramePr>
+            <a:graphic xmlns:a="http://schemas.openxmlformats.org/drawingml/2006/main">
+              <a:graphicData uri="http://schemas.openxmlformats.org/drawingml/2006/picture">
+                <pic:pic xmlns:pic="http://schemas.openxmlformats.org/drawingml/2006/picture">
+                  <pic:nvPicPr>
+                    <pic:cNvPr id="287515609" name=""/>
+                    <pic:cNvPicPr/>
+                  </pic:nvPicPr>
+                  <pic:blipFill rotWithShape="1">
+                    <a:blip r:embed="rId32"/>
+                    <a:srcRect r="17259"/>
+                    <a:stretch>
+                      <a:fillRect/>
+                    </a:stretch>
+                  </pic:blipFill>
+                  <pic:spPr bwMode="auto">
+                    <a:xfrm>
+                      <a:off x="0" y="0"/>
+                      <a:ext cx="4765963" cy="2103755"/>
+                    </a:xfrm>
+                    <a:prstGeom prst="rect">
+                      <a:avLst/>
+                    </a:prstGeom>
+                    <a:ln>
+                      <a:noFill/>
+                    </a:ln>
+                    <a:extLst>
+                      <a:ext uri="{53640926-AAD7-44D8-BBD7-CCE9431645EC}">
+                        <a14:shadowObscured xmlns:a14="http://schemas.microsoft.com/office/drawing/2010/main"/>
+                      </a:ext>
+                    </a:extLst>
+                  </pic:spPr>
+                </pic:pic>
+              </a:graphicData>
+            </a:graphic>
+          </wp:inline>
+        </w:drawing>
+      </w:r>
+    </w:p>
+    <w:p>
+      <w:pPr>
+        <w:pStyle w:val="Descripcin"/>
+        <w:jc w:val="center"/>
+      </w:pPr>
+      <w:r>
+        <w:t xml:space="preserve">Ilustración </w:t>
+      </w:r>
+      <w:fldSimple w:instr=" SEQ Ilustración \* ARABIC ">
+        <w:r>
+          <w:rPr>
+            <w:noProof/>
+          </w:rPr>
+          <w:t>24</w:t>
+        </w:r>
+      </w:fldSimple>
+      <w:r>
+        <w:t xml:space="preserve"> Matriz de requisitos funcionales</w:t>
+      </w:r>
+    </w:p>
+    <w:p>
+      <w:pPr>
+        <w:rPr>
+          <w:lang w:val="es-EC"/>
+        </w:rPr>
+      </w:pPr>
+    </w:p>
+    <w:p>
+      <w:pPr>
+        <w:keepNext/>
+      </w:pPr>
+      <w:r>
+        <w:rPr>
+          <w:lang w:val="es-EC"/>
+        </w:rPr>
+        <w:drawing>
+          <wp:inline distT="0" distB="0" distL="0" distR="0" wp14:anchorId="06D039C6" wp14:editId="4BFBBEB2">
+            <wp:extent cx="5760085" cy="1798320"/>
+            <wp:effectExtent l="0" t="0" r="0" b="0"/>
+            <wp:docPr id="1375743048" name="Imagen 1"/>
+            <wp:cNvGraphicFramePr>
+              <a:graphicFrameLocks xmlns:a="http://schemas.openxmlformats.org/drawingml/2006/main" noChangeAspect="1"/>
+            </wp:cNvGraphicFramePr>
+            <a:graphic xmlns:a="http://schemas.openxmlformats.org/drawingml/2006/main">
+              <a:graphicData uri="http://schemas.openxmlformats.org/drawingml/2006/picture">
+                <pic:pic xmlns:pic="http://schemas.openxmlformats.org/drawingml/2006/picture">
+                  <pic:nvPicPr>
+                    <pic:cNvPr id="1375743048" name=""/>
+                    <pic:cNvPicPr/>
+                  </pic:nvPicPr>
+                  <pic:blipFill>
+                    <a:blip r:embed="rId33"/>
+                    <a:stretch>
+                      <a:fillRect/>
+                    </a:stretch>
+                  </pic:blipFill>
+                  <pic:spPr>
+                    <a:xfrm>
+                      <a:off x="0" y="0"/>
+                      <a:ext cx="5760085" cy="1798320"/>
+                    </a:xfrm>
+                    <a:prstGeom prst="rect">
+                      <a:avLst/>
+                    </a:prstGeom>
+                  </pic:spPr>
+                </pic:pic>
+              </a:graphicData>
+            </a:graphic>
+          </wp:inline>
+        </w:drawing>
+      </w:r>
+    </w:p>
+    <w:p>
+      <w:pPr>
+        <w:pStyle w:val="Descripcin"/>
+        <w:jc w:val="center"/>
+      </w:pPr>
+      <w:r>
+        <w:t xml:space="preserve">Ilustración </w:t>
+      </w:r>
+      <w:fldSimple w:instr=" SEQ Ilustración \* ARABIC ">
+        <w:r>
+          <w:rPr>
+            <w:noProof/>
+          </w:rPr>
+          <w:t>25</w:t>
+        </w:r>
+      </w:fldSimple>
+      <w:r>
+        <w:t xml:space="preserve"> Matriz de requisitos no funcionales</w:t>
+      </w:r>
+      <w:r>
+        <w:br/>
+      </w:r>
+    </w:p>
+    <w:p>
+      <w:pPr>
+        <w:pStyle w:val="Descripcin"/>
+        <w:keepNext/>
+        <w:jc w:val="center"/>
+      </w:pPr>
+      <w:r>
+        <w:lastRenderedPageBreak/>
+        <w:drawing>
+          <wp:inline distT="0" distB="0" distL="0" distR="0" wp14:anchorId="0334B99E" wp14:editId="18C19C2C">
+            <wp:extent cx="4892464" cy="4854361"/>
+            <wp:effectExtent l="0" t="0" r="3810" b="3810"/>
+            <wp:docPr id="1747298413" name="Imagen 1"/>
+            <wp:cNvGraphicFramePr>
+              <a:graphicFrameLocks xmlns:a="http://schemas.openxmlformats.org/drawingml/2006/main" noChangeAspect="1"/>
+            </wp:cNvGraphicFramePr>
+            <a:graphic xmlns:a="http://schemas.openxmlformats.org/drawingml/2006/main">
+              <a:graphicData uri="http://schemas.openxmlformats.org/drawingml/2006/picture">
+                <pic:pic xmlns:pic="http://schemas.openxmlformats.org/drawingml/2006/picture">
+                  <pic:nvPicPr>
+                    <pic:cNvPr id="1747298413" name=""/>
+                    <pic:cNvPicPr/>
+                  </pic:nvPicPr>
+                  <pic:blipFill>
+                    <a:blip r:embed="rId34"/>
+                    <a:stretch>
+                      <a:fillRect/>
+                    </a:stretch>
+                  </pic:blipFill>
+                  <pic:spPr>
+                    <a:xfrm>
+                      <a:off x="0" y="0"/>
+                      <a:ext cx="4892464" cy="4854361"/>
+                    </a:xfrm>
+                    <a:prstGeom prst="rect">
+                      <a:avLst/>
+                    </a:prstGeom>
+                  </pic:spPr>
+                </pic:pic>
+              </a:graphicData>
+            </a:graphic>
+          </wp:inline>
+        </w:drawing>
+      </w:r>
+    </w:p>
+    <w:p>
+      <w:pPr>
+        <w:pStyle w:val="Descripcin"/>
+        <w:jc w:val="center"/>
+      </w:pPr>
+      <w:r>
+        <w:t xml:space="preserve">Ilustración </w:t>
+      </w:r>
+      <w:fldSimple w:instr=" SEQ Ilustración \* ARABIC ">
+        <w:r>
+          <w:rPr>
+            <w:noProof/>
+          </w:rPr>
+          <w:t>26</w:t>
+        </w:r>
+      </w:fldSimple>
+      <w:r>
+        <w:t xml:space="preserve"> Diagrama de casos de uso nivel 0</w:t>
+      </w:r>
+    </w:p>
+    <w:p>
+      <w:pPr>
+        <w:pStyle w:val="Descripcin"/>
+        <w:jc w:val="center"/>
+        <w:rPr>
+          <w:lang w:val="es-EC"/>
+        </w:rPr>
+      </w:pPr>
+      <w:r>
+        <w:br/>
+      </w:r>
     </w:p>
     <w:p>
       <w:pPr>
@@ -8147,6 +8467,7 @@
           <w:szCs w:val="22"/>
           <w:lang w:val="es-EC"/>
         </w:rPr>
+        <w:lastRenderedPageBreak/>
         <w:t>28 de septiembre de 2026</w:t>
       </w:r>
       <w:bookmarkEnd w:id="10"/>
@@ -9067,7 +9388,6 @@
           <w:szCs w:val="22"/>
           <w:lang w:val="es-EC"/>
         </w:rPr>
-        <w:lastRenderedPageBreak/>
         <w:t>5 de noviembre de 2026</w:t>
       </w:r>
       <w:bookmarkEnd w:id="35"/>
@@ -9100,6 +9420,7 @@
           <w:szCs w:val="22"/>
           <w:lang w:val="es-EC"/>
         </w:rPr>
+        <w:lastRenderedPageBreak/>
         <w:t>6 de noviembre de 2026</w:t>
       </w:r>
       <w:bookmarkEnd w:id="36"/>
@@ -9236,8 +9557,8 @@
       </w:pPr>
     </w:p>
     <w:sectPr>
-      <w:headerReference w:type="default" r:id="rId31"/>
-      <w:footerReference w:type="default" r:id="rId32"/>
+      <w:headerReference w:type="default" r:id="rId35"/>
+      <w:footerReference w:type="default" r:id="rId36"/>
       <w:pgSz w:w="11906" w:h="16838"/>
       <w:pgMar w:top="1418" w:right="1134" w:bottom="1418" w:left="1701" w:header="709" w:footer="709" w:gutter="0"/>
       <w:cols w:space="708"/>

</xml_diff>

<commit_message>
Evidencia del 28 de septiembre
</commit_message>
<xml_diff>
--- a/Evidencias/2. Evidencias_PPP_Ayo.docx
+++ b/Evidencias/2. Evidencias_PPP_Ayo.docx
@@ -758,7 +758,29 @@
           <w:szCs w:val="18"/>
           <w:lang w:val="es-EC"/>
         </w:rPr>
-        <w:t>Práctica pre profesional no r</w:t>
+        <w:t xml:space="preserve">Práctica </w:t>
+      </w:r>
+      <w:proofErr w:type="gramStart"/>
+      <w:r>
+        <w:rPr>
+          <w:rFonts w:ascii="Times New Roman" w:hAnsi="Times New Roman"/>
+          <w:b/>
+          <w:sz w:val="18"/>
+          <w:szCs w:val="18"/>
+          <w:lang w:val="es-EC"/>
+        </w:rPr>
+        <w:t>pre profesional</w:t>
+      </w:r>
+      <w:proofErr w:type="gramEnd"/>
+      <w:r>
+        <w:rPr>
+          <w:rFonts w:ascii="Times New Roman" w:hAnsi="Times New Roman"/>
+          <w:b/>
+          <w:sz w:val="18"/>
+          <w:szCs w:val="18"/>
+          <w:lang w:val="es-EC"/>
+        </w:rPr>
+        <w:t xml:space="preserve"> no r</w:t>
       </w:r>
       <w:r>
         <w:rPr>
@@ -5954,7 +5976,7 @@
           <w:lang w:val="es-EC"/>
         </w:rPr>
         <w:drawing>
-          <wp:inline distT="0" distB="0" distL="0" distR="0" wp14:anchorId="58708E0A" wp14:editId="4F7727BA">
+          <wp:inline distT="0" distB="0" distL="0" distR="0" wp14:anchorId="58708E0A" wp14:editId="54C0578D">
             <wp:extent cx="3602383" cy="3337560"/>
             <wp:effectExtent l="0" t="0" r="0" b="0"/>
             <wp:docPr id="1607596467" name="Imagen 1"/>
@@ -6495,7 +6517,7 @@
           <w:noProof/>
         </w:rPr>
         <w:drawing>
-          <wp:inline distT="0" distB="0" distL="0" distR="0" wp14:anchorId="2659E65D" wp14:editId="3CD84260">
+          <wp:inline distT="0" distB="0" distL="0" distR="0" wp14:anchorId="2659E65D" wp14:editId="6EB299BA">
             <wp:extent cx="5375830" cy="2560320"/>
             <wp:effectExtent l="0" t="0" r="0" b="0"/>
             <wp:docPr id="374349723" name="Imagen 24"/>
@@ -6563,10 +6585,12 @@
         <w:t xml:space="preserve"> Creación de repositorio en Git </w:t>
       </w:r>
       <w:proofErr w:type="spellStart"/>
+      <w:proofErr w:type="gramStart"/>
       <w:r>
         <w:t>hub</w:t>
       </w:r>
       <w:proofErr w:type="spellEnd"/>
+      <w:proofErr w:type="gramEnd"/>
     </w:p>
     <w:p/>
     <w:p>
@@ -7046,7 +7070,7 @@
           <w:lang w:val="es-EC"/>
         </w:rPr>
         <w:drawing>
-          <wp:inline distT="0" distB="0" distL="0" distR="0" wp14:anchorId="515B86A1" wp14:editId="3C69AB2A">
+          <wp:inline distT="0" distB="0" distL="0" distR="0" wp14:anchorId="515B86A1" wp14:editId="7B7911F3">
             <wp:extent cx="3253740" cy="3456593"/>
             <wp:effectExtent l="0" t="0" r="3810" b="0"/>
             <wp:docPr id="374329458" name="Imagen 1"/>
@@ -7133,7 +7157,7 @@
           <w:lang w:val="es-EC"/>
         </w:rPr>
         <w:drawing>
-          <wp:inline distT="0" distB="0" distL="0" distR="0" wp14:anchorId="637579D6" wp14:editId="4192EBB7">
+          <wp:inline distT="0" distB="0" distL="0" distR="0" wp14:anchorId="637579D6" wp14:editId="04458E84">
             <wp:extent cx="5033493" cy="2416629"/>
             <wp:effectExtent l="0" t="0" r="0" b="3175"/>
             <wp:docPr id="1502525067" name="Imagen 31"/>
@@ -7491,7 +7515,7 @@
           <w:noProof/>
         </w:rPr>
         <w:drawing>
-          <wp:inline distT="0" distB="0" distL="0" distR="0" wp14:anchorId="5DBA9331" wp14:editId="7E168901">
+          <wp:inline distT="0" distB="0" distL="0" distR="0" wp14:anchorId="5DBA9331" wp14:editId="256A90E6">
             <wp:extent cx="3853501" cy="1871796"/>
             <wp:effectExtent l="0" t="0" r="0" b="0"/>
             <wp:docPr id="104674412" name="Imagen 1"/>
@@ -8116,6 +8140,7 @@
           <w:rFonts w:ascii="Times New Roman" w:hAnsi="Times New Roman" w:cs="Times New Roman"/>
           <w:b/>
           <w:bCs/>
+          <w:noProof/>
           <w:color w:val="auto"/>
           <w:sz w:val="22"/>
           <w:szCs w:val="22"/>
@@ -8216,6 +8241,7 @@
           <w:rFonts w:ascii="Times New Roman" w:hAnsi="Times New Roman" w:cs="Times New Roman"/>
           <w:b/>
           <w:bCs/>
+          <w:noProof/>
           <w:color w:val="auto"/>
           <w:sz w:val="22"/>
           <w:szCs w:val="22"/>
@@ -8300,6 +8326,7 @@
       </w:pPr>
       <w:r>
         <w:rPr>
+          <w:noProof/>
           <w:lang w:val="es-EC"/>
         </w:rPr>
         <w:drawing>
@@ -8369,11 +8396,14 @@
         <w:jc w:val="center"/>
       </w:pPr>
       <w:r>
+        <w:rPr>
+          <w:noProof/>
+        </w:rPr>
         <w:lastRenderedPageBreak/>
         <w:drawing>
-          <wp:inline distT="0" distB="0" distL="0" distR="0" wp14:anchorId="0334B99E" wp14:editId="18C19C2C">
-            <wp:extent cx="4892464" cy="4854361"/>
-            <wp:effectExtent l="0" t="0" r="3810" b="3810"/>
+          <wp:inline distT="0" distB="0" distL="0" distR="0" wp14:anchorId="0334B99E" wp14:editId="3D7D38C9">
+            <wp:extent cx="4589324" cy="4854361"/>
+            <wp:effectExtent l="0" t="0" r="1905" b="3810"/>
             <wp:docPr id="1747298413" name="Imagen 1"/>
             <wp:cNvGraphicFramePr>
               <a:graphicFrameLocks xmlns:a="http://schemas.openxmlformats.org/drawingml/2006/main" noChangeAspect="1"/>
@@ -8382,11 +8412,17 @@
               <a:graphicData uri="http://schemas.openxmlformats.org/drawingml/2006/picture">
                 <pic:pic xmlns:pic="http://schemas.openxmlformats.org/drawingml/2006/picture">
                   <pic:nvPicPr>
-                    <pic:cNvPr id="1747298413" name=""/>
+                    <pic:cNvPr id="1747298413" name="Imagen 1"/>
                     <pic:cNvPicPr/>
                   </pic:nvPicPr>
                   <pic:blipFill>
-                    <a:blip r:embed="rId34"/>
+                    <a:blip r:embed="rId34">
+                      <a:extLst>
+                        <a:ext uri="{28A0092B-C50C-407E-A947-70E740481C1C}">
+                          <a14:useLocalDpi xmlns:a14="http://schemas.microsoft.com/office/drawing/2010/main" val="0"/>
+                        </a:ext>
+                      </a:extLst>
+                    </a:blip>
                     <a:stretch>
                       <a:fillRect/>
                     </a:stretch>
@@ -8394,7 +8430,7 @@
                   <pic:spPr>
                     <a:xfrm>
                       <a:off x="0" y="0"/>
-                      <a:ext cx="4892464" cy="4854361"/>
+                      <a:ext cx="4589324" cy="4854361"/>
                     </a:xfrm>
                     <a:prstGeom prst="rect">
                       <a:avLst/>
@@ -8441,6 +8477,69 @@
     </w:p>
     <w:p>
       <w:pPr>
+        <w:rPr>
+          <w:lang w:val="es-EC"/>
+        </w:rPr>
+      </w:pPr>
+    </w:p>
+    <w:p>
+      <w:pPr>
+        <w:rPr>
+          <w:lang w:val="es-EC"/>
+        </w:rPr>
+      </w:pPr>
+    </w:p>
+    <w:p>
+      <w:pPr>
+        <w:rPr>
+          <w:lang w:val="es-EC"/>
+        </w:rPr>
+      </w:pPr>
+    </w:p>
+    <w:p>
+      <w:pPr>
+        <w:rPr>
+          <w:lang w:val="es-EC"/>
+        </w:rPr>
+      </w:pPr>
+    </w:p>
+    <w:p>
+      <w:pPr>
+        <w:rPr>
+          <w:lang w:val="es-EC"/>
+        </w:rPr>
+      </w:pPr>
+    </w:p>
+    <w:p>
+      <w:pPr>
+        <w:rPr>
+          <w:lang w:val="es-EC"/>
+        </w:rPr>
+      </w:pPr>
+    </w:p>
+    <w:p>
+      <w:pPr>
+        <w:rPr>
+          <w:lang w:val="es-EC"/>
+        </w:rPr>
+      </w:pPr>
+    </w:p>
+    <w:p>
+      <w:pPr>
+        <w:rPr>
+          <w:lang w:val="es-EC"/>
+        </w:rPr>
+      </w:pPr>
+    </w:p>
+    <w:p>
+      <w:pPr>
+        <w:rPr>
+          <w:lang w:val="es-EC"/>
+        </w:rPr>
+      </w:pPr>
+    </w:p>
+    <w:p>
+      <w:pPr>
         <w:pStyle w:val="Ttulo1"/>
         <w:numPr>
           <w:ilvl w:val="0"/>
@@ -8474,6 +8573,401 @@
     </w:p>
     <w:p>
       <w:pPr>
+        <w:rPr>
+          <w:lang w:val="es-EC"/>
+        </w:rPr>
+      </w:pPr>
+    </w:p>
+    <w:p>
+      <w:pPr>
+        <w:keepNext/>
+        <w:jc w:val="center"/>
+      </w:pPr>
+      <w:r>
+        <w:rPr>
+          <w:lang w:val="es-EC"/>
+        </w:rPr>
+        <w:drawing>
+          <wp:inline distT="0" distB="0" distL="0" distR="0" wp14:anchorId="3C1ACD4C" wp14:editId="798A0176">
+            <wp:extent cx="4396636" cy="3297356"/>
+            <wp:effectExtent l="0" t="0" r="4445" b="0"/>
+            <wp:docPr id="820311164" name="Imagen 1"/>
+            <wp:cNvGraphicFramePr>
+              <a:graphicFrameLocks xmlns:a="http://schemas.openxmlformats.org/drawingml/2006/main" noChangeAspect="1"/>
+            </wp:cNvGraphicFramePr>
+            <a:graphic xmlns:a="http://schemas.openxmlformats.org/drawingml/2006/main">
+              <a:graphicData uri="http://schemas.openxmlformats.org/drawingml/2006/picture">
+                <pic:pic xmlns:pic="http://schemas.openxmlformats.org/drawingml/2006/picture">
+                  <pic:nvPicPr>
+                    <pic:cNvPr id="820311164" name=""/>
+                    <pic:cNvPicPr/>
+                  </pic:nvPicPr>
+                  <pic:blipFill>
+                    <a:blip r:embed="rId35"/>
+                    <a:stretch>
+                      <a:fillRect/>
+                    </a:stretch>
+                  </pic:blipFill>
+                  <pic:spPr>
+                    <a:xfrm>
+                      <a:off x="0" y="0"/>
+                      <a:ext cx="4400151" cy="3299992"/>
+                    </a:xfrm>
+                    <a:prstGeom prst="rect">
+                      <a:avLst/>
+                    </a:prstGeom>
+                  </pic:spPr>
+                </pic:pic>
+              </a:graphicData>
+            </a:graphic>
+          </wp:inline>
+        </w:drawing>
+      </w:r>
+    </w:p>
+    <w:p>
+      <w:pPr>
+        <w:pStyle w:val="Descripcin"/>
+        <w:jc w:val="center"/>
+        <w:rPr>
+          <w:lang w:val="es-EC"/>
+        </w:rPr>
+      </w:pPr>
+      <w:r>
+        <w:t xml:space="preserve">Ilustración </w:t>
+      </w:r>
+      <w:fldSimple w:instr=" SEQ Ilustración \* ARABIC ">
+        <w:r>
+          <w:rPr>
+            <w:noProof/>
+          </w:rPr>
+          <w:t>27</w:t>
+        </w:r>
+      </w:fldSimple>
+      <w:r>
+        <w:t xml:space="preserve"> CU01-Nivel 1</w:t>
+      </w:r>
+    </w:p>
+    <w:p>
+      <w:pPr>
+        <w:keepNext/>
+        <w:jc w:val="center"/>
+      </w:pPr>
+    </w:p>
+    <w:p>
+      <w:pPr>
+        <w:keepNext/>
+        <w:jc w:val="center"/>
+      </w:pPr>
+    </w:p>
+    <w:p>
+      <w:pPr>
+        <w:keepNext/>
+        <w:jc w:val="center"/>
+      </w:pPr>
+      <w:r>
+        <w:rPr>
+          <w:lang w:val="es-EC"/>
+        </w:rPr>
+        <w:drawing>
+          <wp:inline distT="0" distB="0" distL="0" distR="0" wp14:anchorId="511F6E14" wp14:editId="3DCEE848">
+            <wp:extent cx="4397121" cy="5349704"/>
+            <wp:effectExtent l="0" t="0" r="3810" b="3810"/>
+            <wp:docPr id="1826088909" name="Imagen 1"/>
+            <wp:cNvGraphicFramePr>
+              <a:graphicFrameLocks xmlns:a="http://schemas.openxmlformats.org/drawingml/2006/main" noChangeAspect="1"/>
+            </wp:cNvGraphicFramePr>
+            <a:graphic xmlns:a="http://schemas.openxmlformats.org/drawingml/2006/main">
+              <a:graphicData uri="http://schemas.openxmlformats.org/drawingml/2006/picture">
+                <pic:pic xmlns:pic="http://schemas.openxmlformats.org/drawingml/2006/picture">
+                  <pic:nvPicPr>
+                    <pic:cNvPr id="1826088909" name=""/>
+                    <pic:cNvPicPr/>
+                  </pic:nvPicPr>
+                  <pic:blipFill>
+                    <a:blip r:embed="rId36"/>
+                    <a:stretch>
+                      <a:fillRect/>
+                    </a:stretch>
+                  </pic:blipFill>
+                  <pic:spPr>
+                    <a:xfrm>
+                      <a:off x="0" y="0"/>
+                      <a:ext cx="4397121" cy="5349704"/>
+                    </a:xfrm>
+                    <a:prstGeom prst="rect">
+                      <a:avLst/>
+                    </a:prstGeom>
+                  </pic:spPr>
+                </pic:pic>
+              </a:graphicData>
+            </a:graphic>
+          </wp:inline>
+        </w:drawing>
+      </w:r>
+    </w:p>
+    <w:p>
+      <w:pPr>
+        <w:pStyle w:val="Descripcin"/>
+        <w:jc w:val="center"/>
+        <w:rPr>
+          <w:lang w:val="es-EC"/>
+        </w:rPr>
+      </w:pPr>
+      <w:r>
+        <w:t xml:space="preserve">Ilustración </w:t>
+      </w:r>
+      <w:fldSimple w:instr=" SEQ Ilustración \* ARABIC ">
+        <w:r>
+          <w:rPr>
+            <w:noProof/>
+          </w:rPr>
+          <w:t>28</w:t>
+        </w:r>
+      </w:fldSimple>
+      <w:r>
+        <w:t xml:space="preserve"> CU02-Nivel1</w:t>
+      </w:r>
+    </w:p>
+    <w:p>
+      <w:pPr>
+        <w:keepNext/>
+        <w:jc w:val="center"/>
+      </w:pPr>
+      <w:r>
+        <w:rPr>
+          <w:lang w:val="es-EC"/>
+        </w:rPr>
+        <w:lastRenderedPageBreak/>
+        <w:drawing>
+          <wp:inline distT="0" distB="0" distL="0" distR="0" wp14:anchorId="091EE006" wp14:editId="44DBB6D2">
+            <wp:extent cx="4691330" cy="8393561"/>
+            <wp:effectExtent l="0" t="0" r="0" b="7620"/>
+            <wp:docPr id="2121165603" name="Imagen 8"/>
+            <wp:cNvGraphicFramePr>
+              <a:graphicFrameLocks xmlns:a="http://schemas.openxmlformats.org/drawingml/2006/main" noChangeAspect="1"/>
+            </wp:cNvGraphicFramePr>
+            <a:graphic xmlns:a="http://schemas.openxmlformats.org/drawingml/2006/main">
+              <a:graphicData uri="http://schemas.openxmlformats.org/drawingml/2006/picture">
+                <pic:pic xmlns:pic="http://schemas.openxmlformats.org/drawingml/2006/picture">
+                  <pic:nvPicPr>
+                    <pic:cNvPr id="0" name="Picture 6"/>
+                    <pic:cNvPicPr>
+                      <a:picLocks noChangeAspect="1" noChangeArrowheads="1"/>
+                    </pic:cNvPicPr>
+                  </pic:nvPicPr>
+                  <pic:blipFill>
+                    <a:blip r:embed="rId37">
+                      <a:extLst>
+                        <a:ext uri="{28A0092B-C50C-407E-A947-70E740481C1C}">
+                          <a14:useLocalDpi xmlns:a14="http://schemas.microsoft.com/office/drawing/2010/main" val="0"/>
+                        </a:ext>
+                      </a:extLst>
+                    </a:blip>
+                    <a:srcRect/>
+                    <a:stretch>
+                      <a:fillRect/>
+                    </a:stretch>
+                  </pic:blipFill>
+                  <pic:spPr bwMode="auto">
+                    <a:xfrm>
+                      <a:off x="0" y="0"/>
+                      <a:ext cx="4692567" cy="8395774"/>
+                    </a:xfrm>
+                    <a:prstGeom prst="rect">
+                      <a:avLst/>
+                    </a:prstGeom>
+                    <a:noFill/>
+                    <a:ln>
+                      <a:noFill/>
+                    </a:ln>
+                  </pic:spPr>
+                </pic:pic>
+              </a:graphicData>
+            </a:graphic>
+          </wp:inline>
+        </w:drawing>
+      </w:r>
+    </w:p>
+    <w:p>
+      <w:pPr>
+        <w:pStyle w:val="Descripcin"/>
+        <w:jc w:val="center"/>
+        <w:rPr>
+          <w:lang w:val="es-EC"/>
+        </w:rPr>
+      </w:pPr>
+      <w:r>
+        <w:t xml:space="preserve">Ilustración </w:t>
+      </w:r>
+      <w:fldSimple w:instr=" SEQ Ilustración \* ARABIC ">
+        <w:r>
+          <w:rPr>
+            <w:noProof/>
+          </w:rPr>
+          <w:t>29</w:t>
+        </w:r>
+      </w:fldSimple>
+      <w:r>
+        <w:t xml:space="preserve"> CU03-Nivel1</w:t>
+      </w:r>
+    </w:p>
+    <w:p>
+      <w:pPr>
+        <w:rPr>
+          <w:lang w:val="es-EC"/>
+        </w:rPr>
+      </w:pPr>
+    </w:p>
+    <w:p>
+      <w:pPr>
+        <w:keepNext/>
+      </w:pPr>
+      <w:r>
+        <w:rPr>
+          <w:lang w:val="es-EC"/>
+        </w:rPr>
+        <w:drawing>
+          <wp:inline distT="0" distB="0" distL="0" distR="0" wp14:anchorId="4858140B" wp14:editId="76EB46B9">
+            <wp:extent cx="5760085" cy="5303520"/>
+            <wp:effectExtent l="0" t="0" r="0" b="0"/>
+            <wp:docPr id="1562228808" name="Imagen 1"/>
+            <wp:cNvGraphicFramePr>
+              <a:graphicFrameLocks xmlns:a="http://schemas.openxmlformats.org/drawingml/2006/main" noChangeAspect="1"/>
+            </wp:cNvGraphicFramePr>
+            <a:graphic xmlns:a="http://schemas.openxmlformats.org/drawingml/2006/main">
+              <a:graphicData uri="http://schemas.openxmlformats.org/drawingml/2006/picture">
+                <pic:pic xmlns:pic="http://schemas.openxmlformats.org/drawingml/2006/picture">
+                  <pic:nvPicPr>
+                    <pic:cNvPr id="1562228808" name=""/>
+                    <pic:cNvPicPr/>
+                  </pic:nvPicPr>
+                  <pic:blipFill>
+                    <a:blip r:embed="rId38"/>
+                    <a:stretch>
+                      <a:fillRect/>
+                    </a:stretch>
+                  </pic:blipFill>
+                  <pic:spPr>
+                    <a:xfrm>
+                      <a:off x="0" y="0"/>
+                      <a:ext cx="5760085" cy="5303520"/>
+                    </a:xfrm>
+                    <a:prstGeom prst="rect">
+                      <a:avLst/>
+                    </a:prstGeom>
+                  </pic:spPr>
+                </pic:pic>
+              </a:graphicData>
+            </a:graphic>
+          </wp:inline>
+        </w:drawing>
+      </w:r>
+    </w:p>
+    <w:p>
+      <w:pPr>
+        <w:pStyle w:val="Descripcin"/>
+        <w:jc w:val="center"/>
+      </w:pPr>
+      <w:r>
+        <w:t xml:space="preserve">Ilustración </w:t>
+      </w:r>
+      <w:fldSimple w:instr=" SEQ Ilustración \* ARABIC ">
+        <w:r>
+          <w:rPr>
+            <w:noProof/>
+          </w:rPr>
+          <w:t>30</w:t>
+        </w:r>
+      </w:fldSimple>
+      <w:r>
+        <w:t xml:space="preserve"> CU04- Nivel1</w:t>
+      </w:r>
+    </w:p>
+    <w:p>
+      <w:pPr>
+        <w:rPr>
+          <w:lang w:val="es-EC"/>
+        </w:rPr>
+      </w:pPr>
+    </w:p>
+    <w:p>
+      <w:pPr>
+        <w:rPr>
+          <w:lang w:val="es-EC"/>
+        </w:rPr>
+      </w:pPr>
+    </w:p>
+    <w:p>
+      <w:pPr>
+        <w:keepNext/>
+      </w:pPr>
+      <w:r>
+        <w:rPr>
+          <w:lang w:val="es-EC"/>
+        </w:rPr>
+        <w:lastRenderedPageBreak/>
+        <w:drawing>
+          <wp:inline distT="0" distB="0" distL="0" distR="0" wp14:anchorId="63BFDEE6" wp14:editId="52D706AE">
+            <wp:extent cx="5738357" cy="4823878"/>
+            <wp:effectExtent l="0" t="0" r="0" b="0"/>
+            <wp:docPr id="1621238213" name="Imagen 1"/>
+            <wp:cNvGraphicFramePr>
+              <a:graphicFrameLocks xmlns:a="http://schemas.openxmlformats.org/drawingml/2006/main" noChangeAspect="1"/>
+            </wp:cNvGraphicFramePr>
+            <a:graphic xmlns:a="http://schemas.openxmlformats.org/drawingml/2006/main">
+              <a:graphicData uri="http://schemas.openxmlformats.org/drawingml/2006/picture">
+                <pic:pic xmlns:pic="http://schemas.openxmlformats.org/drawingml/2006/picture">
+                  <pic:nvPicPr>
+                    <pic:cNvPr id="1621238213" name=""/>
+                    <pic:cNvPicPr/>
+                  </pic:nvPicPr>
+                  <pic:blipFill>
+                    <a:blip r:embed="rId39"/>
+                    <a:stretch>
+                      <a:fillRect/>
+                    </a:stretch>
+                  </pic:blipFill>
+                  <pic:spPr>
+                    <a:xfrm>
+                      <a:off x="0" y="0"/>
+                      <a:ext cx="5738357" cy="4823878"/>
+                    </a:xfrm>
+                    <a:prstGeom prst="rect">
+                      <a:avLst/>
+                    </a:prstGeom>
+                  </pic:spPr>
+                </pic:pic>
+              </a:graphicData>
+            </a:graphic>
+          </wp:inline>
+        </w:drawing>
+      </w:r>
+    </w:p>
+    <w:p>
+      <w:pPr>
+        <w:pStyle w:val="Descripcin"/>
+        <w:jc w:val="center"/>
+        <w:rPr>
+          <w:lang w:val="es-EC"/>
+        </w:rPr>
+      </w:pPr>
+      <w:r>
+        <w:t xml:space="preserve">Ilustración </w:t>
+      </w:r>
+      <w:fldSimple w:instr=" SEQ Ilustración \* ARABIC ">
+        <w:r>
+          <w:rPr>
+            <w:noProof/>
+          </w:rPr>
+          <w:t>31</w:t>
+        </w:r>
+      </w:fldSimple>
+      <w:r>
+        <w:t xml:space="preserve"> CU05-Nivel1</w:t>
+      </w:r>
+    </w:p>
+    <w:p>
+      <w:pPr>
         <w:pStyle w:val="Ttulo1"/>
         <w:numPr>
           <w:ilvl w:val="0"/>
@@ -8500,6 +8994,7 @@
           <w:szCs w:val="22"/>
           <w:lang w:val="es-EC"/>
         </w:rPr>
+        <w:lastRenderedPageBreak/>
         <w:t>29 de septiembre de 2026</w:t>
       </w:r>
       <w:bookmarkEnd w:id="11"/>
@@ -9420,7 +9915,6 @@
           <w:szCs w:val="22"/>
           <w:lang w:val="es-EC"/>
         </w:rPr>
-        <w:lastRenderedPageBreak/>
         <w:t>6 de noviembre de 2026</w:t>
       </w:r>
       <w:bookmarkEnd w:id="36"/>
@@ -9453,6 +9947,7 @@
           <w:szCs w:val="22"/>
           <w:lang w:val="es-EC"/>
         </w:rPr>
+        <w:lastRenderedPageBreak/>
         <w:t>9 de noviembre de 2026</w:t>
       </w:r>
       <w:bookmarkEnd w:id="37"/>
@@ -9557,8 +10052,8 @@
       </w:pPr>
     </w:p>
     <w:sectPr>
-      <w:headerReference w:type="default" r:id="rId35"/>
-      <w:footerReference w:type="default" r:id="rId36"/>
+      <w:headerReference w:type="default" r:id="rId40"/>
+      <w:footerReference w:type="default" r:id="rId41"/>
       <w:pgSz w:w="11906" w:h="16838"/>
       <w:pgMar w:top="1418" w:right="1134" w:bottom="1418" w:left="1701" w:header="709" w:footer="709" w:gutter="0"/>
       <w:cols w:space="708"/>
@@ -10642,7 +11137,6 @@
   <w:style w:type="character" w:default="1" w:styleId="Fuentedeprrafopredeter">
     <w:name w:val="Default Paragraph Font"/>
     <w:uiPriority w:val="1"/>
-    <w:semiHidden/>
     <w:unhideWhenUsed/>
   </w:style>
   <w:style w:type="table" w:default="1" w:styleId="Tablanormal">

</xml_diff>